<commit_message>
Remove travessao longo dos dois entregaveis
Substitui o travessao com espacos por virgula, dois pontos ou parenteses
conforme o contexto de cada frase, seguindo a regra de estilo da conta.
Aplicado ao HTML e ao gerador do PDF, com PDF regerado e prototipo
retestado no navegador.

Co-Authored-By: Claude Opus 5 <noreply@anthropic.com>
Claude-Session: https://claude.ai/code/session_01LsdicPUvmRw2B7pU1Xwhg6
</commit_message>
<xml_diff>
--- a/clinica-lc/Clinica-LC-Plano-Tecnico-e-Custos.docx
+++ b/clinica-lc/Clinica-LC-Plano-Tecnico-e-Custos.docx
@@ -482,7 +482,7 @@
                 <w:sz w:val="17"/>
                 <w:szCs w:val="17"/>
               </w:rPr>
-              <w:t xml:space="preserve">USO INTERNO — contém margem, custo e estratégia de preço</w:t>
+              <w:t xml:space="preserve">USO INTERNO: contém margem, custo e estratégia de preço</w:t>
             </w:r>
           </w:p>
         </w:tc>
@@ -544,7 +544,7 @@
           <w:sz w:val="19"/>
           <w:szCs w:val="19"/>
         </w:rPr>
-        <w:t xml:space="preserve">A Clínica LC quer um aplicativo que transforme o protocolo médico em rotina diária acompanhada. Hoje o médico prescreve por e-mail e agenda pelo Google Calendar, a comunicação acontece em grupos de WhatsApp e o agendamento depende de uma recepcionista que só atende em horário comercial — enquanto o paciente, majoritariamente mulher, 35+, alto poder aquisitivo e agenda cheia, responde fora desse horário.</w:t>
+        <w:t xml:space="preserve">A Clínica LC quer um aplicativo que transforme o protocolo médico em rotina diária acompanhada. Hoje o médico prescreve por e-mail e agenda pelo Google Calendar, a comunicação acontece em grupos de WhatsApp e o agendamento depende de uma recepcionista que só atende em horário comercial, enquanto o paciente, majoritariamente mulher, 35+, alto poder aquisitivo e agenda cheia, responde fora desse horário.</w:t>
       </w:r>
     </w:p>
     <w:p>
@@ -1402,7 +1402,7 @@
           <w:sz w:val="20"/>
           <w:szCs w:val="20"/>
         </w:rPr>
-        <w:t xml:space="preserve">Bloco A · MVP — entra nas 12 semanas</w:t>
+        <w:t xml:space="preserve">Bloco A · MVP, entra nas 12 semanas</w:t>
       </w:r>
     </w:p>
     <w:tbl>
@@ -2604,7 +2604,7 @@
           <w:sz w:val="20"/>
           <w:szCs w:val="20"/>
         </w:rPr>
-        <w:t xml:space="preserve">Bloco B · Fase 2 — depois do lançamento</w:t>
+        <w:t xml:space="preserve">Bloco B · Fase 2, depois do lançamento</w:t>
       </w:r>
     </w:p>
     <w:p>
@@ -2678,7 +2678,7 @@
           <w:sz w:val="19"/>
           <w:szCs w:val="19"/>
         </w:rPr>
-        <w:t xml:space="preserve">A própria cliente apontou que isso vive no prontuário e só o médico acessa. No MVP o app mostra um resumo de resultados que o profissional libera explicitamente — não é prontuário eletrônico.</w:t>
+        <w:t xml:space="preserve">A própria cliente apontou que isso vive no prontuário e só o médico acessa. No MVP o app mostra um resumo de resultados que o profissional libera explicitamente, não é prontuário eletrônico.</w:t>
       </w:r>
     </w:p>
     <w:p>
@@ -2810,7 +2810,7 @@
           <w:sz w:val="20"/>
           <w:szCs w:val="20"/>
         </w:rPr>
-        <w:t xml:space="preserve">Bloco C · Fora de escopo — precisa estar escrito na proposta</w:t>
+        <w:t xml:space="preserve">Bloco C · Fora de escopo, precisa estar escrito na proposta</w:t>
       </w:r>
     </w:p>
     <w:p>
@@ -2914,7 +2914,7 @@
           <w:sz w:val="19"/>
           <w:szCs w:val="19"/>
         </w:rPr>
-        <w:t xml:space="preserve">Gestão de tráfego pago e CRM — ficou combinado indicar um parceiro.</w:t>
+        <w:t xml:space="preserve">Gestão de tráfego pago e CRM, ficou combinado indicar um parceiro.</w:t>
       </w:r>
     </w:p>
     <w:p>
@@ -3397,7 +3397,7 @@
                 <w:sz w:val="17"/>
                 <w:szCs w:val="17"/>
               </w:rPr>
-              <w:t xml:space="preserve">Relacional, que é o que este domínio pede. Dado de saúde permanece em território nacional — argumento comercial e de LGPD.</w:t>
+              <w:t xml:space="preserve">Relacional, que é o que este domínio pede. Dado de saúde permanece em território nacional, argumento comercial e de LGPD.</w:t>
             </w:r>
           </w:p>
         </w:tc>
@@ -6546,7 +6546,7 @@
                 <w:sz w:val="18"/>
                 <w:szCs w:val="18"/>
               </w:rPr>
-              <w:t xml:space="preserve">Primeira: adesão é calculada uma vez por dia e gravada em adherence_daily, em vez de ser recalculada a cada abertura de tela. Sem isso, a tela de evolução fica lenta já no terceiro mês de uso. Segunda: exam_results guarda resultado em pares chave-valor e não como PDF anexado, porque foi pedido gráfico de 'como o paciente chegou e como ele está' — e não se faz gráfico a partir de PDF.</w:t>
+              <w:t xml:space="preserve">Primeira: adesão é calculada uma vez por dia e gravada em adherence_daily, em vez de ser recalculada a cada abertura de tela. Sem isso, a tela de evolução fica lenta já no terceiro mês de uso. Segunda: exam_results guarda resultado em pares chave-valor e não como PDF anexado, porque foi pedido gráfico de 'como o paciente chegou e como ele está', e não se faz gráfico a partir de PDF.</w:t>
             </w:r>
           </w:p>
         </w:tc>
@@ -6703,7 +6703,7 @@
           <w:sz w:val="19"/>
           <w:szCs w:val="19"/>
         </w:rPr>
-        <w:t xml:space="preserve">Trata dado em nome da clínica. Isso exige um contrato de operador anexo ao contrato principal — não é opcional e protege os dois lados.</w:t>
+        <w:t xml:space="preserve">Trata dado em nome da clínica. Isso exige um contrato de operador anexo ao contrato principal, não é opcional e protege os dois lados.</w:t>
       </w:r>
     </w:p>
     <w:p>
@@ -6742,7 +6742,7 @@
           <w:sz w:val="19"/>
           <w:szCs w:val="19"/>
         </w:rPr>
-        <w:t xml:space="preserve">Para o dado clínico, a base é a tutela da saúde em procedimento realizado por profissionais de saúde (Art. 11, II, 'f'), que dispensa consentimento. Para tudo que não é assistencial — ranking, notificação motivacional, e-mail — a base é consentimento específico e destacado, que o paciente pode revogar sem perder acesso ao app.</w:t>
+        <w:t xml:space="preserve">Para o dado clínico, a base é a tutela da saúde em procedimento realizado por profissionais de saúde (Art. 11, II, 'f'), que dispensa consentimento. Para tudo que não é assistencial (ranking, notificação motivacional, e-mail) a base é consentimento específico e destacado, que o paciente pode revogar sem perder acesso ao app.</w:t>
       </w:r>
     </w:p>
     <w:p>
@@ -6959,7 +6959,7 @@
           <w:sz w:val="19"/>
           <w:szCs w:val="19"/>
         </w:rPr>
-        <w:t xml:space="preserve">Exclusão de conta dentro do app — exigência formal da Apple (Guideline 5.1.1) e direito do titular pela LGPD.</w:t>
+        <w:t xml:space="preserve">Exclusão de conta dentro do app, exigência formal da Apple (Guideline 5.1.1) e direito do titular pela LGPD.</w:t>
       </w:r>
     </w:p>
     <w:p>
@@ -8174,7 +8174,7 @@
                 <w:sz w:val="18"/>
                 <w:szCs w:val="18"/>
               </w:rPr>
-              <w:t xml:space="preserve">Abrir as duas contas e solicitar o D-U-N-S no primeiro dia útil após a assinatura, antes de escrever a primeira linha de código. É a tarefa de menor esforço e maior risco de cronograma do projeto inteiro — e depende da clínica, não de nós.</w:t>
+              <w:t xml:space="preserve">Abrir as duas contas e solicitar o D-U-N-S no primeiro dia útil após a assinatura, antes de escrever a primeira linha de código. É a tarefa de menor esforço e maior risco de cronograma do projeto inteiro, e depende da clínica, não de nós.</w:t>
             </w:r>
           </w:p>
         </w:tc>
@@ -8236,7 +8236,7 @@
           <w:sz w:val="19"/>
           <w:szCs w:val="19"/>
         </w:rPr>
-        <w:t xml:space="preserve">Duas trilhas paralelas. Dev A cuida do cliente (app e painel), Dev B cuida do servidor (banco, regras, funções). O contrato entre as duas trilhas — tipos TypeScript e schema do banco — é fechado na semana 1 e vira a única fonte de verdade.</w:t>
+        <w:t xml:space="preserve">Duas trilhas paralelas. Dev A cuida do cliente (app e painel), Dev B cuida do servidor (banco, regras, funções). O contrato entre as duas trilhas (tipos TypeScript e schema do banco) é fechado na semana 1 e vira a única fonte de verdade.</w:t>
       </w:r>
     </w:p>
     <w:p>
@@ -9697,7 +9697,7 @@
           <w:sz w:val="19"/>
           <w:szCs w:val="19"/>
         </w:rPr>
-        <w:t xml:space="preserve">Não em 'código pronto' — em app disponível para download.</w:t>
+        <w:t xml:space="preserve">Não em 'código pronto', e sim em app disponível para download.</w:t>
       </w:r>
     </w:p>
     <w:p>
@@ -10452,7 +10452,7 @@
           <w:sz w:val="19"/>
           <w:szCs w:val="19"/>
         </w:rPr>
-        <w:t xml:space="preserve">Começar pela configuração recomendada e subir apenas se houver bloqueio real. A diferença entre a opção econômica e a recomendada ao longo de 3 meses é de R$ 1.680 — irrelevante diante do custo de uma semana perdida.</w:t>
+        <w:t xml:space="preserve">Começar pela configuração recomendada e subir apenas se houver bloqueio real. A diferença entre a opção econômica e a recomendada ao longo de 3 meses é de R$ 1.680, irrelevante diante do custo de uma semana perdida.</w:t>
       </w:r>
     </w:p>
     <w:p>
@@ -10532,7 +10532,7 @@
           <w:sz w:val="20"/>
           <w:szCs w:val="20"/>
         </w:rPr>
-        <w:t xml:space="preserve">A · Setup, pagamento único — fica com a Clínica LC</w:t>
+        <w:t xml:space="preserve">A · Setup, pagamento único, fica com a Clínica LC</w:t>
       </w:r>
     </w:p>
     <w:tbl>
@@ -11169,7 +11169,7 @@
           <w:sz w:val="20"/>
           <w:szCs w:val="20"/>
         </w:rPr>
-        <w:t xml:space="preserve">B · Build, 3 meses — custo da Modesto</w:t>
+        <w:t xml:space="preserve">B · Build, 3 meses, custo da Modesto</w:t>
       </w:r>
     </w:p>
     <w:tbl>
@@ -16463,7 +16463,7 @@
           <w:sz w:val="19"/>
           <w:szCs w:val="19"/>
         </w:rPr>
-        <w:t xml:space="preserve">A mensalidade cobre: hospedagem e banco, monitoramento, correção de defeito, atualização obrigatória de SDK das lojas (que acontece todo ano e não é negociável), suporte à equipe da clínica e uma evolução pequena por mês. Contrato mínimo de 12 meses, reajuste anual por índice. Deixar claro que sem sustentação o app para de funcionar em algum momento — não por má-fé, mas porque Apple e Google forçam atualização de SDK periodicamente.</w:t>
+        <w:t xml:space="preserve">A mensalidade cobre: hospedagem e banco, monitoramento, correção de defeito, atualização obrigatória de SDK das lojas (que acontece todo ano e não é negociável), suporte à equipe da clínica e uma evolução pequena por mês. Contrato mínimo de 12 meses, reajuste anual por índice. Deixar claro que sem sustentação o app para de funcionar em algum momento, não por má-fé, mas porque Apple e Google forçam atualização de SDK periodicamente.</w:t>
       </w:r>
     </w:p>
     <w:p>

</xml_diff>

<commit_message>
Troca a assinatura dos entregaveis de Modesto para Bytech
O logo anterior era uma imagem com a palavra Modesto escrita, entao a troca
nao podia ser so de texto. Gera um lockup tipografico BYTECH na mesma paleta
(bege, preto, dourado) em tres variantes: capa, rodape e marca d'agua.

- brand/bytech_docx.js: modulo de marca apontando para os novos assets
- Rodape passa a usar so a palavra, legivel em tamanho reduzido
- Marca d'agua reduzida de 42 para 24 de alfa
- Textos ajustados nos dois arquivos: operadora LGPD, custo do build,
  custo do primeiro ano e titularidade do codigo

Dominio ainda nao definido, o rodape traz "Bytech · Desenvolvimento de software".

Co-Authored-By: Claude Opus 5 <noreply@anthropic.com>
Claude-Session: https://claude.ai/code/session_01LsdicPUvmRw2B7pU1Xwhg6
</commit_message>
<xml_diff>
--- a/clinica-lc/Clinica-LC-Plano-Tecnico-e-Custos.docx
+++ b/clinica-lc/Clinica-LC-Plano-Tecnico-e-Custos.docx
@@ -918,7 +918,7 @@
                 <w:sz w:val="17"/>
                 <w:szCs w:val="17"/>
               </w:rPr>
-              <w:t xml:space="preserve">Custo de plataforma para a Modesto no build</w:t>
+              <w:t xml:space="preserve">Custo de plataforma para a Bytech no build</w:t>
             </w:r>
           </w:p>
         </w:tc>
@@ -6694,7 +6694,7 @@
           <w:sz w:val="19"/>
           <w:szCs w:val="19"/>
         </w:rPr>
-        <w:t xml:space="preserve">Modesto Growth é a operadora. </w:t>
+        <w:t xml:space="preserve">A Bytech é a operadora. </w:t>
       </w:r>
       <w:r>
         <w:rPr>
@@ -11169,7 +11169,7 @@
           <w:sz w:val="20"/>
           <w:szCs w:val="20"/>
         </w:rPr>
-        <w:t xml:space="preserve">B · Build, 3 meses, custo da Modesto</w:t>
+        <w:t xml:space="preserve">B · Build, 3 meses, custo da Bytech</w:t>
       </w:r>
     </w:p>
     <w:tbl>
@@ -13116,7 +13116,7 @@
           <w:sz w:val="20"/>
           <w:szCs w:val="20"/>
         </w:rPr>
-        <w:t xml:space="preserve">D · Custo total do primeiro ano para a Modesto</w:t>
+        <w:t xml:space="preserve">D · Custo total do primeiro ano para a Bytech</w:t>
       </w:r>
     </w:p>
     <w:tbl>
@@ -16732,7 +16732,7 @@
                 <w:sz w:val="18"/>
                 <w:szCs w:val="18"/>
               </w:rPr>
-              <w:t xml:space="preserve">Quem fica dono do código e em nome de quem ficam as contas das lojas. Recomendação: as contas ficam no CNPJ da clínica, porque é o correto para um app médico, e o código permanece da Modesto, com licença de uso perpétua e irrevogável para a Clínica LC enquanto o contrato de sustentação estiver ativo. Se a clínica exigir a cessão total do código, isso é outro produto e o preço sobe para a faixa de teto.</w:t>
+              <w:t xml:space="preserve">Quem fica dono do código e em nome de quem ficam as contas das lojas. Recomendação: as contas ficam no CNPJ da clínica, porque é o correto para um app médico, e o código permanece da Bytech, com licença de uso perpétua e irrevogável para a Clínica LC enquanto o contrato de sustentação estiver ativo. Se a clínica exigir a cessão total do código, isso é outro produto e o preço sobe para a faixa de teto.</w:t>
             </w:r>
           </w:p>
         </w:tc>
@@ -16805,7 +16805,7 @@
     <w:r>
       <w:drawing>
         <wp:inline distT="0" distB="0" distL="0" distR="0">
-          <wp:extent cx="666750" cy="222250"/>
+          <wp:extent cx="590550" cy="141384"/>
           <wp:effectExtent t="0" r="0" b="0" l="0"/>
           <wp:docPr id="1" name="" descr="" title=""/>
           <wp:cNvGraphicFramePr>
@@ -16830,7 +16830,7 @@
                 <pic:spPr bwMode="auto">
                   <a:xfrm>
                     <a:off x="0" y="0"/>
-                    <a:ext cx="666750" cy="222250"/>
+                    <a:ext cx="590550" cy="141384"/>
                   </a:xfrm>
                   <a:prstGeom prst="rect">
                     <a:avLst/>
@@ -16849,7 +16849,7 @@
         <w:sz w:val="14"/>
         <w:szCs w:val="14"/>
       </w:rPr>
-      <w:t xml:space="preserve">	Modesto Growth Partners  ·  modestogrowth.com.br</w:t>
+      <w:t xml:space="preserve">	Bytech  ·  Desenvolvimento de software</w:t>
     </w:r>
   </w:p>
 </w:ftr>

</xml_diff>

<commit_message>
Separa os custos em tres blocos de tempo e corrige contagem dupla
Os valores estavam diluidos em rateio anual e o custo dos 3 meses de build,
onde estao as duas assinaturas de IA, nao aparecia no slide do cliente.
Passa a mostrar: pagamento unico antes de comecar, total do periodo de
construcao e custo recorrente a partir do 4o mes.

Corrige contagem dupla: a conta Apple estava lancada como custo da clinica
na secao A e de novo como rateio mensal da Bytech na secao C.

Numeros conferidos a partir das taxas de origem (USD 5,60):
- Build 3 meses: 7.548 (IA 5.040 + compilacao 2.228 + banco 280), 2.516/mes
- Operacao mensal: 703 (IA 560 + banco 140 + dominio 3), 1.263 com 2 contas
- Ano 1 Bytech: 13.915 (era 14.329)
- Margem da sustentacao: 2.197/mes, 26.364/ano

Co-Authored-By: Claude Opus 5 <noreply@anthropic.com>
Claude-Session: https://claude.ai/code/session_01LsdicPUvmRw2B7pU1Xwhg6
</commit_message>
<xml_diff>
--- a/clinica-lc/Clinica-LC-Plano-Tecnico-e-Custos.docx
+++ b/clinica-lc/Clinica-LC-Plano-Tecnico-e-Custos.docx
@@ -1038,7 +1038,7 @@
                 <w:sz w:val="17"/>
                 <w:szCs w:val="17"/>
               </w:rPr>
-              <w:t xml:space="preserve">Custo de operação depois do lançamento</w:t>
+              <w:t xml:space="preserve">Custo mensal a partir do 4º mês</w:t>
             </w:r>
           </w:p>
         </w:tc>
@@ -1067,7 +1067,7 @@
                 <w:sz w:val="17"/>
                 <w:szCs w:val="17"/>
               </w:rPr>
-              <w:t xml:space="preserve">R$ 189/mês de infraestrutura</w:t>
+              <w:t xml:space="preserve">R$ 703 (infraestrutura + 1 assinatura de IA)</w:t>
             </w:r>
           </w:p>
         </w:tc>
@@ -12270,7 +12270,25 @@
           <w:sz w:val="20"/>
           <w:szCs w:val="20"/>
         </w:rPr>
-        <w:t xml:space="preserve">C · Operação, depois do lançamento</w:t>
+        <w:t xml:space="preserve">C · Operação, mensal, a partir do 4º mês</w:t>
+      </w:r>
+    </w:p>
+    <w:p>
+      <w:pPr>
+        <w:spacing w:after="140" w:line="290"/>
+      </w:pPr>
+      <w:r>
+        <w:rPr>
+          <w:rFonts w:ascii="Inter" w:cs="Inter" w:eastAsia="Inter" w:hAnsi="Inter"/>
+          <w:b w:val="false"/>
+          <w:bCs w:val="false"/>
+          <w:i/>
+          <w:iCs/>
+          <w:color w:val="4A4A46"/>
+          <w:sz w:val="19"/>
+          <w:szCs w:val="19"/>
+        </w:rPr>
+        <w:t xml:space="preserve">A partir daqui não existe mais custo de build. O que sobra é a conta de manter o app no ar mais uma assinatura de IA para a sustentação.</w:t>
       </w:r>
     </w:p>
     <w:tbl>
@@ -12296,7 +12314,7 @@
         </w:trPr>
         <w:tc>
           <w:tcPr>
-            <w:tcW w:type="pct" w:w="34%"/>
+            <w:tcW w:type="pct" w:w="30%"/>
             <w:gridSpan w:val="1"/>
             <w:shd w:fill="1A1A18" w:color="auto" w:val="clear"/>
             <w:tcMar>
@@ -12326,7 +12344,7 @@
         </w:tc>
         <w:tc>
           <w:tcPr>
-            <w:tcW w:type="pct" w:w="18%"/>
+            <w:tcW w:type="pct" w:w="16%"/>
             <w:gridSpan w:val="1"/>
             <w:shd w:fill="1A1A18" w:color="auto" w:val="clear"/>
             <w:tcMar>
@@ -12356,7 +12374,7 @@
         </w:tc>
         <w:tc>
           <w:tcPr>
-            <w:tcW w:type="pct" w:w="48%"/>
+            <w:tcW w:type="pct" w:w="54%"/>
             <w:gridSpan w:val="1"/>
             <w:shd w:fill="1A1A18" w:color="auto" w:val="clear"/>
             <w:tcMar>
@@ -12388,88 +12406,88 @@
       <w:tr>
         <w:tc>
           <w:tcPr>
-            <w:tcW w:type="pct" w:w="34%"/>
-            <w:gridSpan w:val="1"/>
-            <w:shd w:fill="FAFAF7" w:color="auto" w:val="clear"/>
-            <w:tcMar>
-              <w:top w:type="dxa" w:w="110"/>
-              <w:left w:type="dxa" w:w="150"/>
-              <w:bottom w:type="dxa" w:w="110"/>
-              <w:right w:type="dxa" w:w="150"/>
-            </w:tcMar>
-          </w:tcPr>
-          <w:p>
-            <w:pPr>
-              <w:jc w:val="left"/>
-            </w:pPr>
-            <w:r>
-              <w:rPr>
-                <w:rFonts w:ascii="Inter" w:cs="Inter" w:eastAsia="Inter" w:hAnsi="Inter"/>
-                <w:b w:val="false"/>
-                <w:bCs w:val="false"/>
-                <w:color w:val="4A4A46"/>
-                <w:sz w:val="17"/>
-                <w:szCs w:val="17"/>
-              </w:rPr>
-              <w:t xml:space="preserve">Banco de dados gerenciado</w:t>
-            </w:r>
-          </w:p>
-        </w:tc>
-        <w:tc>
-          <w:tcPr>
-            <w:tcW w:type="pct" w:w="18%"/>
-            <w:gridSpan w:val="1"/>
-            <w:shd w:fill="FAFAF7" w:color="auto" w:val="clear"/>
-            <w:tcMar>
-              <w:top w:type="dxa" w:w="110"/>
-              <w:left w:type="dxa" w:w="150"/>
-              <w:bottom w:type="dxa" w:w="110"/>
-              <w:right w:type="dxa" w:w="150"/>
-            </w:tcMar>
-          </w:tcPr>
-          <w:p>
-            <w:pPr>
-              <w:jc w:val="left"/>
-            </w:pPr>
-            <w:r>
-              <w:rPr>
-                <w:rFonts w:ascii="Inter" w:cs="Inter" w:eastAsia="Inter" w:hAnsi="Inter"/>
-                <w:b w:val="false"/>
-                <w:bCs w:val="false"/>
-                <w:color w:val="4A4A46"/>
-                <w:sz w:val="17"/>
-                <w:szCs w:val="17"/>
-              </w:rPr>
-              <w:t xml:space="preserve">R$ 140</w:t>
-            </w:r>
-          </w:p>
-        </w:tc>
-        <w:tc>
-          <w:tcPr>
-            <w:tcW w:type="pct" w:w="48%"/>
-            <w:gridSpan w:val="1"/>
-            <w:shd w:fill="FAFAF7" w:color="auto" w:val="clear"/>
-            <w:tcMar>
-              <w:top w:type="dxa" w:w="110"/>
-              <w:left w:type="dxa" w:w="150"/>
-              <w:bottom w:type="dxa" w:w="110"/>
-              <w:right w:type="dxa" w:w="150"/>
-            </w:tcMar>
-          </w:tcPr>
-          <w:p>
-            <w:pPr>
-              <w:jc w:val="left"/>
-            </w:pPr>
-            <w:r>
-              <w:rPr>
-                <w:rFonts w:ascii="Inter" w:cs="Inter" w:eastAsia="Inter" w:hAnsi="Inter"/>
-                <w:b w:val="false"/>
-                <w:bCs w:val="false"/>
-                <w:color w:val="4A4A46"/>
-                <w:sz w:val="17"/>
-                <w:szCs w:val="17"/>
-              </w:rPr>
-              <w:t xml:space="preserve">Cobre com folga a base inicial. O item que cresce primeiro é armazenamento de exame</w:t>
+            <w:tcW w:type="pct" w:w="30%"/>
+            <w:gridSpan w:val="1"/>
+            <w:shd w:fill="FAFAF7" w:color="auto" w:val="clear"/>
+            <w:tcMar>
+              <w:top w:type="dxa" w:w="110"/>
+              <w:left w:type="dxa" w:w="150"/>
+              <w:bottom w:type="dxa" w:w="110"/>
+              <w:right w:type="dxa" w:w="150"/>
+            </w:tcMar>
+          </w:tcPr>
+          <w:p>
+            <w:pPr>
+              <w:jc w:val="left"/>
+            </w:pPr>
+            <w:r>
+              <w:rPr>
+                <w:rFonts w:ascii="Inter" w:cs="Inter" w:eastAsia="Inter" w:hAnsi="Inter"/>
+                <w:b w:val="false"/>
+                <w:bCs w:val="false"/>
+                <w:color w:val="4A4A46"/>
+                <w:sz w:val="17"/>
+                <w:szCs w:val="17"/>
+              </w:rPr>
+              <w:t xml:space="preserve">Claude Max 5x, 1 conta</w:t>
+            </w:r>
+          </w:p>
+        </w:tc>
+        <w:tc>
+          <w:tcPr>
+            <w:tcW w:type="pct" w:w="16%"/>
+            <w:gridSpan w:val="1"/>
+            <w:shd w:fill="FAFAF7" w:color="auto" w:val="clear"/>
+            <w:tcMar>
+              <w:top w:type="dxa" w:w="110"/>
+              <w:left w:type="dxa" w:w="150"/>
+              <w:bottom w:type="dxa" w:w="110"/>
+              <w:right w:type="dxa" w:w="150"/>
+            </w:tcMar>
+          </w:tcPr>
+          <w:p>
+            <w:pPr>
+              <w:jc w:val="left"/>
+            </w:pPr>
+            <w:r>
+              <w:rPr>
+                <w:rFonts w:ascii="Inter" w:cs="Inter" w:eastAsia="Inter" w:hAnsi="Inter"/>
+                <w:b w:val="false"/>
+                <w:bCs w:val="false"/>
+                <w:color w:val="4A4A46"/>
+                <w:sz w:val="17"/>
+                <w:szCs w:val="17"/>
+              </w:rPr>
+              <w:t xml:space="preserve">R$ 560</w:t>
+            </w:r>
+          </w:p>
+        </w:tc>
+        <w:tc>
+          <w:tcPr>
+            <w:tcW w:type="pct" w:w="54%"/>
+            <w:gridSpan w:val="1"/>
+            <w:shd w:fill="FAFAF7" w:color="auto" w:val="clear"/>
+            <w:tcMar>
+              <w:top w:type="dxa" w:w="110"/>
+              <w:left w:type="dxa" w:w="150"/>
+              <w:bottom w:type="dxa" w:w="110"/>
+              <w:right w:type="dxa" w:w="150"/>
+            </w:tcMar>
+          </w:tcPr>
+          <w:p>
+            <w:pPr>
+              <w:jc w:val="left"/>
+            </w:pPr>
+            <w:r>
+              <w:rPr>
+                <w:rFonts w:ascii="Inter" w:cs="Inter" w:eastAsia="Inter" w:hAnsi="Inter"/>
+                <w:b w:val="false"/>
+                <w:bCs w:val="false"/>
+                <w:color w:val="4A4A46"/>
+                <w:sz w:val="17"/>
+                <w:szCs w:val="17"/>
+              </w:rPr>
+              <w:t xml:space="preserve">Sustentação exige menos que o build. A segunda conta pode ser cancelada ou rebaixada no fim do 3º mês</w:t>
             </w:r>
           </w:p>
         </w:tc>
@@ -12477,88 +12495,88 @@
       <w:tr>
         <w:tc>
           <w:tcPr>
-            <w:tcW w:type="pct" w:w="34%"/>
-            <w:gridSpan w:val="1"/>
-            <w:shd w:fill="FAFAF7" w:color="auto" w:val="clear"/>
-            <w:tcMar>
-              <w:top w:type="dxa" w:w="110"/>
-              <w:left w:type="dxa" w:w="150"/>
-              <w:bottom w:type="dxa" w:w="110"/>
-              <w:right w:type="dxa" w:w="150"/>
-            </w:tcMar>
-          </w:tcPr>
-          <w:p>
-            <w:pPr>
-              <w:jc w:val="left"/>
-            </w:pPr>
-            <w:r>
-              <w:rPr>
-                <w:rFonts w:ascii="Inter" w:cs="Inter" w:eastAsia="Inter" w:hAnsi="Inter"/>
-                <w:b w:val="false"/>
-                <w:bCs w:val="false"/>
-                <w:color w:val="4A4A46"/>
-                <w:sz w:val="17"/>
-                <w:szCs w:val="17"/>
-              </w:rPr>
-              <w:t xml:space="preserve">Apple Developer (rateio anual)</w:t>
-            </w:r>
-          </w:p>
-        </w:tc>
-        <w:tc>
-          <w:tcPr>
-            <w:tcW w:type="pct" w:w="18%"/>
-            <w:gridSpan w:val="1"/>
-            <w:shd w:fill="FAFAF7" w:color="auto" w:val="clear"/>
-            <w:tcMar>
-              <w:top w:type="dxa" w:w="110"/>
-              <w:left w:type="dxa" w:w="150"/>
-              <w:bottom w:type="dxa" w:w="110"/>
-              <w:right w:type="dxa" w:w="150"/>
-            </w:tcMar>
-          </w:tcPr>
-          <w:p>
-            <w:pPr>
-              <w:jc w:val="left"/>
-            </w:pPr>
-            <w:r>
-              <w:rPr>
-                <w:rFonts w:ascii="Inter" w:cs="Inter" w:eastAsia="Inter" w:hAnsi="Inter"/>
-                <w:b w:val="false"/>
-                <w:bCs w:val="false"/>
-                <w:color w:val="4A4A46"/>
-                <w:sz w:val="17"/>
-                <w:szCs w:val="17"/>
-              </w:rPr>
-              <w:t xml:space="preserve">R$ 46</w:t>
-            </w:r>
-          </w:p>
-        </w:tc>
-        <w:tc>
-          <w:tcPr>
-            <w:tcW w:type="pct" w:w="48%"/>
-            <w:gridSpan w:val="1"/>
-            <w:shd w:fill="FAFAF7" w:color="auto" w:val="clear"/>
-            <w:tcMar>
-              <w:top w:type="dxa" w:w="110"/>
-              <w:left w:type="dxa" w:w="150"/>
-              <w:bottom w:type="dxa" w:w="110"/>
-              <w:right w:type="dxa" w:w="150"/>
-            </w:tcMar>
-          </w:tcPr>
-          <w:p>
-            <w:pPr>
-              <w:jc w:val="left"/>
-            </w:pPr>
-            <w:r>
-              <w:rPr>
-                <w:rFonts w:ascii="Inter" w:cs="Inter" w:eastAsia="Inter" w:hAnsi="Inter"/>
-                <w:b w:val="false"/>
-                <w:bCs w:val="false"/>
-                <w:color w:val="4A4A46"/>
-                <w:sz w:val="17"/>
-                <w:szCs w:val="17"/>
-              </w:rPr>
-              <w:t xml:space="preserve">US$ 99 ÷ 12</w:t>
+            <w:tcW w:type="pct" w:w="30%"/>
+            <w:gridSpan w:val="1"/>
+            <w:shd w:fill="FAFAF7" w:color="auto" w:val="clear"/>
+            <w:tcMar>
+              <w:top w:type="dxa" w:w="110"/>
+              <w:left w:type="dxa" w:w="150"/>
+              <w:bottom w:type="dxa" w:w="110"/>
+              <w:right w:type="dxa" w:w="150"/>
+            </w:tcMar>
+          </w:tcPr>
+          <w:p>
+            <w:pPr>
+              <w:jc w:val="left"/>
+            </w:pPr>
+            <w:r>
+              <w:rPr>
+                <w:rFonts w:ascii="Inter" w:cs="Inter" w:eastAsia="Inter" w:hAnsi="Inter"/>
+                <w:b w:val="false"/>
+                <w:bCs w:val="false"/>
+                <w:color w:val="4A4A46"/>
+                <w:sz w:val="17"/>
+                <w:szCs w:val="17"/>
+              </w:rPr>
+              <w:t xml:space="preserve">Banco de dados gerenciado</w:t>
+            </w:r>
+          </w:p>
+        </w:tc>
+        <w:tc>
+          <w:tcPr>
+            <w:tcW w:type="pct" w:w="16%"/>
+            <w:gridSpan w:val="1"/>
+            <w:shd w:fill="FAFAF7" w:color="auto" w:val="clear"/>
+            <w:tcMar>
+              <w:top w:type="dxa" w:w="110"/>
+              <w:left w:type="dxa" w:w="150"/>
+              <w:bottom w:type="dxa" w:w="110"/>
+              <w:right w:type="dxa" w:w="150"/>
+            </w:tcMar>
+          </w:tcPr>
+          <w:p>
+            <w:pPr>
+              <w:jc w:val="left"/>
+            </w:pPr>
+            <w:r>
+              <w:rPr>
+                <w:rFonts w:ascii="Inter" w:cs="Inter" w:eastAsia="Inter" w:hAnsi="Inter"/>
+                <w:b w:val="false"/>
+                <w:bCs w:val="false"/>
+                <w:color w:val="4A4A46"/>
+                <w:sz w:val="17"/>
+                <w:szCs w:val="17"/>
+              </w:rPr>
+              <w:t xml:space="preserve">R$ 140</w:t>
+            </w:r>
+          </w:p>
+        </w:tc>
+        <w:tc>
+          <w:tcPr>
+            <w:tcW w:type="pct" w:w="54%"/>
+            <w:gridSpan w:val="1"/>
+            <w:shd w:fill="FAFAF7" w:color="auto" w:val="clear"/>
+            <w:tcMar>
+              <w:top w:type="dxa" w:w="110"/>
+              <w:left w:type="dxa" w:w="150"/>
+              <w:bottom w:type="dxa" w:w="110"/>
+              <w:right w:type="dxa" w:w="150"/>
+            </w:tcMar>
+          </w:tcPr>
+          <w:p>
+            <w:pPr>
+              <w:jc w:val="left"/>
+            </w:pPr>
+            <w:r>
+              <w:rPr>
+                <w:rFonts w:ascii="Inter" w:cs="Inter" w:eastAsia="Inter" w:hAnsi="Inter"/>
+                <w:b w:val="false"/>
+                <w:bCs w:val="false"/>
+                <w:color w:val="4A4A46"/>
+                <w:sz w:val="17"/>
+                <w:szCs w:val="17"/>
+              </w:rPr>
+              <w:t xml:space="preserve">Cobre com folga a base inicial. O item que cresce primeiro é armazenamento de exame</w:t>
             </w:r>
           </w:p>
         </w:tc>
@@ -12566,7 +12584,7 @@
       <w:tr>
         <w:tc>
           <w:tcPr>
-            <w:tcW w:type="pct" w:w="34%"/>
+            <w:tcW w:type="pct" w:w="30%"/>
             <w:gridSpan w:val="1"/>
             <w:shd w:fill="FAFAF7" w:color="auto" w:val="clear"/>
             <w:tcMar>
@@ -12595,7 +12613,7 @@
         </w:tc>
         <w:tc>
           <w:tcPr>
-            <w:tcW w:type="pct" w:w="18%"/>
+            <w:tcW w:type="pct" w:w="16%"/>
             <w:gridSpan w:val="1"/>
             <w:shd w:fill="FAFAF7" w:color="auto" w:val="clear"/>
             <w:tcMar>
@@ -12624,7 +12642,7 @@
         </w:tc>
         <w:tc>
           <w:tcPr>
-            <w:tcW w:type="pct" w:w="48%"/>
+            <w:tcW w:type="pct" w:w="54%"/>
             <w:gridSpan w:val="1"/>
             <w:shd w:fill="FAFAF7" w:color="auto" w:val="clear"/>
             <w:tcMar>
@@ -12655,7 +12673,7 @@
       <w:tr>
         <w:tc>
           <w:tcPr>
-            <w:tcW w:type="pct" w:w="34%"/>
+            <w:tcW w:type="pct" w:w="30%"/>
             <w:gridSpan w:val="1"/>
             <w:shd w:fill="FAFAF7" w:color="auto" w:val="clear"/>
             <w:tcMar>
@@ -12684,7 +12702,7 @@
         </w:tc>
         <w:tc>
           <w:tcPr>
-            <w:tcW w:type="pct" w:w="18%"/>
+            <w:tcW w:type="pct" w:w="16%"/>
             <w:gridSpan w:val="1"/>
             <w:shd w:fill="FAFAF7" w:color="auto" w:val="clear"/>
             <w:tcMar>
@@ -12713,7 +12731,7 @@
         </w:tc>
         <w:tc>
           <w:tcPr>
-            <w:tcW w:type="pct" w:w="48%"/>
+            <w:tcW w:type="pct" w:w="54%"/>
             <w:gridSpan w:val="1"/>
             <w:shd w:fill="FAFAF7" w:color="auto" w:val="clear"/>
             <w:tcMar>
@@ -12744,7 +12762,7 @@
       <w:tr>
         <w:tc>
           <w:tcPr>
-            <w:tcW w:type="pct" w:w="34%"/>
+            <w:tcW w:type="pct" w:w="30%"/>
             <w:gridSpan w:val="1"/>
             <w:shd w:fill="FAFAF7" w:color="auto" w:val="clear"/>
             <w:tcMar>
@@ -12773,7 +12791,7 @@
         </w:tc>
         <w:tc>
           <w:tcPr>
-            <w:tcW w:type="pct" w:w="18%"/>
+            <w:tcW w:type="pct" w:w="16%"/>
             <w:gridSpan w:val="1"/>
             <w:shd w:fill="FAFAF7" w:color="auto" w:val="clear"/>
             <w:tcMar>
@@ -12802,7 +12820,7 @@
         </w:tc>
         <w:tc>
           <w:tcPr>
-            <w:tcW w:type="pct" w:w="48%"/>
+            <w:tcW w:type="pct" w:w="54%"/>
             <w:gridSpan w:val="1"/>
             <w:shd w:fill="FAFAF7" w:color="auto" w:val="clear"/>
             <w:tcMar>
@@ -12833,7 +12851,7 @@
       <w:tr>
         <w:tc>
           <w:tcPr>
-            <w:tcW w:type="pct" w:w="34%"/>
+            <w:tcW w:type="pct" w:w="30%"/>
             <w:gridSpan w:val="1"/>
             <w:shd w:fill="FAFAF7" w:color="auto" w:val="clear"/>
             <w:tcMar>
@@ -12862,7 +12880,7 @@
         </w:tc>
         <w:tc>
           <w:tcPr>
-            <w:tcW w:type="pct" w:w="18%"/>
+            <w:tcW w:type="pct" w:w="16%"/>
             <w:gridSpan w:val="1"/>
             <w:shd w:fill="FAFAF7" w:color="auto" w:val="clear"/>
             <w:tcMar>
@@ -12891,7 +12909,7 @@
         </w:tc>
         <w:tc>
           <w:tcPr>
-            <w:tcW w:type="pct" w:w="48%"/>
+            <w:tcW w:type="pct" w:w="54%"/>
             <w:gridSpan w:val="1"/>
             <w:shd w:fill="FAFAF7" w:color="auto" w:val="clear"/>
             <w:tcMar>
@@ -12922,7 +12940,7 @@
       <w:tr>
         <w:tc>
           <w:tcPr>
-            <w:tcW w:type="pct" w:w="34%"/>
+            <w:tcW w:type="pct" w:w="30%"/>
             <w:gridSpan w:val="1"/>
             <w:shd w:fill="FAFAF7" w:color="auto" w:val="clear"/>
             <w:tcMar>
@@ -12951,7 +12969,7 @@
         </w:tc>
         <w:tc>
           <w:tcPr>
-            <w:tcW w:type="pct" w:w="18%"/>
+            <w:tcW w:type="pct" w:w="16%"/>
             <w:gridSpan w:val="1"/>
             <w:shd w:fill="FAFAF7" w:color="auto" w:val="clear"/>
             <w:tcMar>
@@ -12980,7 +12998,7 @@
         </w:tc>
         <w:tc>
           <w:tcPr>
-            <w:tcW w:type="pct" w:w="48%"/>
+            <w:tcW w:type="pct" w:w="54%"/>
             <w:gridSpan w:val="1"/>
             <w:shd w:fill="FAFAF7" w:color="auto" w:val="clear"/>
             <w:tcMar>
@@ -13011,7 +13029,7 @@
       <w:tr>
         <w:tc>
           <w:tcPr>
-            <w:tcW w:type="pct" w:w="34%"/>
+            <w:tcW w:type="pct" w:w="30%"/>
             <w:gridSpan w:val="1"/>
             <w:shd w:fill="F2EEE2" w:color="auto" w:val="clear"/>
             <w:tcMar>
@@ -13034,13 +13052,13 @@
                 <w:sz w:val="17"/>
                 <w:szCs w:val="17"/>
               </w:rPr>
-              <w:t xml:space="preserve">Total de infraestrutura</w:t>
-            </w:r>
-          </w:p>
-        </w:tc>
-        <w:tc>
-          <w:tcPr>
-            <w:tcW w:type="pct" w:w="18%"/>
+              <w:t xml:space="preserve">Total</w:t>
+            </w:r>
+          </w:p>
+        </w:tc>
+        <w:tc>
+          <w:tcPr>
+            <w:tcW w:type="pct" w:w="16%"/>
             <w:gridSpan w:val="1"/>
             <w:shd w:fill="F2EEE2" w:color="auto" w:val="clear"/>
             <w:tcMar>
@@ -13063,13 +13081,13 @@
                 <w:sz w:val="17"/>
                 <w:szCs w:val="17"/>
               </w:rPr>
-              <w:t xml:space="preserve">R$ 189</w:t>
-            </w:r>
-          </w:p>
-        </w:tc>
-        <w:tc>
-          <w:tcPr>
-            <w:tcW w:type="pct" w:w="48%"/>
+              <w:t xml:space="preserve">R$ 703</w:t>
+            </w:r>
+          </w:p>
+        </w:tc>
+        <w:tc>
+          <w:tcPr>
+            <w:tcW w:type="pct" w:w="54%"/>
             <w:gridSpan w:val="1"/>
             <w:shd w:fill="F2EEE2" w:color="auto" w:val="clear"/>
             <w:tcMar>
@@ -13092,12 +13110,35 @@
                 <w:sz w:val="17"/>
                 <w:szCs w:val="17"/>
               </w:rPr>
-              <w:t xml:space="preserve">Sem contar mão de obra de sustentação</w:t>
+              <w:t xml:space="preserve">Custo mensal recorrente da Bytech</w:t>
             </w:r>
           </w:p>
         </w:tc>
       </w:tr>
     </w:tbl>
+    <w:p>
+      <w:pPr>
+        <w:spacing w:after="100"/>
+      </w:pPr>
+    </w:p>
+    <w:p>
+      <w:pPr>
+        <w:spacing w:after="140" w:line="290"/>
+      </w:pPr>
+      <w:r>
+        <w:rPr>
+          <w:rFonts w:ascii="Inter" w:cs="Inter" w:eastAsia="Inter" w:hAnsi="Inter"/>
+          <w:b w:val="false"/>
+          <w:bCs w:val="false"/>
+          <w:i/>
+          <w:iCs/>
+          <w:color w:val="4A4A46"/>
+          <w:sz w:val="19"/>
+          <w:szCs w:val="19"/>
+        </w:rPr>
+        <w:t xml:space="preserve">A renovação anual da conta Apple, de R$ 554, não entra aqui porque fica com a Clínica LC, conforme a seção A. Manter as duas assinaturas de IA na sustentação em vez de uma leva este total de R$ 703 para R$ 1.263 por mês.</w:t>
+      </w:r>
+    </w:p>
     <w:p>
       <w:pPr>
         <w:spacing w:after="140"/>
@@ -13226,7 +13267,7 @@
                 <w:sz w:val="17"/>
                 <w:szCs w:val="17"/>
               </w:rPr>
-              <w:t xml:space="preserve">Build, 3 meses (seção B)</w:t>
+              <w:t xml:space="preserve">Domínio, pago no início</w:t>
             </w:r>
           </w:p>
         </w:tc>
@@ -13255,7 +13296,7 @@
                 <w:sz w:val="17"/>
                 <w:szCs w:val="17"/>
               </w:rPr>
-              <w:t xml:space="preserve">R$ 7.548</w:t>
+              <w:t xml:space="preserve">R$ 40</w:t>
             </w:r>
           </w:p>
         </w:tc>
@@ -13286,7 +13327,7 @@
                 <w:sz w:val="17"/>
                 <w:szCs w:val="17"/>
               </w:rPr>
-              <w:t xml:space="preserve">Domínio</w:t>
+              <w:t xml:space="preserve">Build, 3 meses (seção B)</w:t>
             </w:r>
           </w:p>
         </w:tc>
@@ -13315,7 +13356,7 @@
                 <w:sz w:val="17"/>
                 <w:szCs w:val="17"/>
               </w:rPr>
-              <w:t xml:space="preserve">R$ 40</w:t>
+              <w:t xml:space="preserve">R$ 7.548</w:t>
             </w:r>
           </w:p>
         </w:tc>
@@ -13346,7 +13387,7 @@
                 <w:sz w:val="17"/>
                 <w:szCs w:val="17"/>
               </w:rPr>
-              <w:t xml:space="preserve">Infraestrutura em operação, 9 meses</w:t>
+              <w:t xml:space="preserve">Operação, 9 meses × R$ 703 (seção C)</w:t>
             </w:r>
           </w:p>
         </w:tc>
@@ -13375,67 +13416,7 @@
                 <w:sz w:val="17"/>
                 <w:szCs w:val="17"/>
               </w:rPr>
-              <w:t xml:space="preserve">R$ 1.701</w:t>
-            </w:r>
-          </w:p>
-        </w:tc>
-      </w:tr>
-      <w:tr>
-        <w:tc>
-          <w:tcPr>
-            <w:tcW w:type="pct" w:w="62%"/>
-            <w:gridSpan w:val="1"/>
-            <w:shd w:fill="FAFAF7" w:color="auto" w:val="clear"/>
-            <w:tcMar>
-              <w:top w:type="dxa" w:w="110"/>
-              <w:left w:type="dxa" w:w="150"/>
-              <w:bottom w:type="dxa" w:w="110"/>
-              <w:right w:type="dxa" w:w="150"/>
-            </w:tcMar>
-          </w:tcPr>
-          <w:p>
-            <w:pPr>
-              <w:jc w:val="left"/>
-            </w:pPr>
-            <w:r>
-              <w:rPr>
-                <w:rFonts w:ascii="Inter" w:cs="Inter" w:eastAsia="Inter" w:hAnsi="Inter"/>
-                <w:b w:val="false"/>
-                <w:bCs w:val="false"/>
-                <w:color w:val="4A4A46"/>
-                <w:sz w:val="17"/>
-                <w:szCs w:val="17"/>
-              </w:rPr>
-              <w:t xml:space="preserve">1 conta Claude Max 5x para sustentação, 9 meses</w:t>
-            </w:r>
-          </w:p>
-        </w:tc>
-        <w:tc>
-          <w:tcPr>
-            <w:tcW w:type="pct" w:w="38%"/>
-            <w:gridSpan w:val="1"/>
-            <w:shd w:fill="FAFAF7" w:color="auto" w:val="clear"/>
-            <w:tcMar>
-              <w:top w:type="dxa" w:w="110"/>
-              <w:left w:type="dxa" w:w="150"/>
-              <w:bottom w:type="dxa" w:w="110"/>
-              <w:right w:type="dxa" w:w="150"/>
-            </w:tcMar>
-          </w:tcPr>
-          <w:p>
-            <w:pPr>
-              <w:jc w:val="left"/>
-            </w:pPr>
-            <w:r>
-              <w:rPr>
-                <w:rFonts w:ascii="Inter" w:cs="Inter" w:eastAsia="Inter" w:hAnsi="Inter"/>
-                <w:b w:val="false"/>
-                <w:bCs w:val="false"/>
-                <w:color w:val="4A4A46"/>
-                <w:sz w:val="17"/>
-                <w:szCs w:val="17"/>
-              </w:rPr>
-              <w:t xml:space="preserve">R$ 5.040</w:t>
+              <w:t xml:space="preserve">R$ 6.327</w:t>
             </w:r>
           </w:p>
         </w:tc>
@@ -13495,7 +13476,7 @@
                 <w:sz w:val="17"/>
                 <w:szCs w:val="17"/>
               </w:rPr>
-              <w:t xml:space="preserve">R$ 14.329</w:t>
+              <w:t xml:space="preserve">R$ 13.915</w:t>
             </w:r>
           </w:p>
         </w:tc>
@@ -16288,7 +16269,7 @@
                 <w:sz w:val="17"/>
                 <w:szCs w:val="17"/>
               </w:rPr>
-              <w:t xml:space="preserve">Custo de infraestrutura e IA</w:t>
+              <w:t xml:space="preserve">Custo de infraestrutura e IA (seção 9C)</w:t>
             </w:r>
           </w:p>
         </w:tc>
@@ -16317,7 +16298,7 @@
                 <w:sz w:val="17"/>
                 <w:szCs w:val="17"/>
               </w:rPr>
-              <w:t xml:space="preserve">R$ 749 por mês</w:t>
+              <w:t xml:space="preserve">R$ 703 por mês</w:t>
             </w:r>
           </w:p>
         </w:tc>
@@ -16377,7 +16358,7 @@
                 <w:sz w:val="17"/>
                 <w:szCs w:val="17"/>
               </w:rPr>
-              <w:t xml:space="preserve">R$ 2.151</w:t>
+              <w:t xml:space="preserve">R$ 2.197</w:t>
             </w:r>
           </w:p>
         </w:tc>
@@ -16437,7 +16418,7 @@
                 <w:sz w:val="17"/>
                 <w:szCs w:val="17"/>
               </w:rPr>
-              <w:t xml:space="preserve">R$ 25.812</w:t>
+              <w:t xml:space="preserve">R$ 26.364</w:t>
             </w:r>
           </w:p>
         </w:tc>
@@ -16558,7 +16539,7 @@
           <w:sz w:val="19"/>
           <w:szCs w:val="19"/>
         </w:rPr>
-        <w:t xml:space="preserve">R$ 694 no ano para ela e R$ 189 por mês de infraestrutura. Isso estabelece que somos transparentes e faz o honorário parecer o que de fato é: trabalho, não intermediação.</w:t>
+        <w:t xml:space="preserve">R$ 694 uma vez para ela, R$ 7.548 que a Bytech gasta nos três meses de construção e R$ 703 por mês depois que o app entra no ar. Isso estabelece que somos transparentes e faz o honorário parecer o que de fato é: trabalho, não intermediação.</w:t>
       </w:r>
     </w:p>
     <w:p>

</xml_diff>

<commit_message>
Ajusta o plano para duas contas Claude Max 5x
Troca a configuracao de 1x20x + 1x5x por 2x5x (US$ 200/mes) e propaga o
numero por todas as tabelas dos dois arquivos.

- Build 3 meses: 5.868 (era 7.548), media de 1.956/mes
  mes 1 = 1.120, meses 2 e 3 = 2.374 cada
- Ano 1 Bytech: 12.235 (era 13.915)
- Margem em honorario de 89.000: 83.132, ou 13.855 por pessoa por mes
- Operacao mensal segue em 703, com 1 conta na sustentacao

A secao 8 passa a registrar 2x5x como configuracao adotada e mantem a rota
de escape documentada: o teto do 5x costuma travar em refatoracao de schema
nas semanas 3 e 7, e subir uma das contas custa R$ 560/mes.

Co-Authored-By: Claude Opus 5 <noreply@anthropic.com>
Claude-Session: https://claude.ai/code/session_01LsdicPUvmRw2B7pU1Xwhg6
</commit_message>
<xml_diff>
--- a/clinica-lc/Clinica-LC-Plano-Tecnico-e-Custos.docx
+++ b/clinica-lc/Clinica-LC-Plano-Tecnico-e-Custos.docx
@@ -947,7 +947,7 @@
                 <w:sz w:val="17"/>
                 <w:szCs w:val="17"/>
               </w:rPr>
-              <w:t xml:space="preserve">R$ 7.548 (3 meses)</w:t>
+              <w:t xml:space="preserve">R$ 5.868 (3 meses)</w:t>
             </w:r>
           </w:p>
         </w:tc>
@@ -10248,7 +10248,7 @@
                 <w:sz w:val="17"/>
                 <w:szCs w:val="17"/>
               </w:rPr>
-              <w:t xml:space="preserve">Funciona, mas o teto de uso costuma ser atingido em sessões longas de refatoração de backend</w:t>
+              <w:t xml:space="preserve">CONFIGURAÇÃO ADOTADA. É o orçamento deste plano</w:t>
             </w:r>
           </w:p>
         </w:tc>
@@ -10337,7 +10337,7 @@
                 <w:sz w:val="17"/>
                 <w:szCs w:val="17"/>
               </w:rPr>
-              <w:t xml:space="preserve">RECOMENDADO. O 20x fica com quem faz migração, RLS e refatoração pesada</w:t>
+              <w:t xml:space="preserve">Rota de escape. Subir só a conta de quem faz migração, RLS e refatoração pesada</w:t>
             </w:r>
           </w:p>
         </w:tc>
@@ -10426,7 +10426,7 @@
                 <w:sz w:val="17"/>
                 <w:szCs w:val="17"/>
               </w:rPr>
-              <w:t xml:space="preserve">Confortável. Só se justifica se o cronograma apertar</w:t>
+              <w:t xml:space="preserve">Só se o cronograma apertar de verdade</w:t>
             </w:r>
           </w:p>
         </w:tc>
@@ -10452,7 +10452,30 @@
           <w:sz w:val="19"/>
           <w:szCs w:val="19"/>
         </w:rPr>
-        <w:t xml:space="preserve">Começar pela configuração recomendada e subir apenas se houver bloqueio real. A diferença entre a opção econômica e a recomendada ao longo de 3 meses é de R$ 1.680, irrelevante diante do custo de uma semana perdida.</w:t>
+        <w:t xml:space="preserve">O plano trabalha com duas contas Max 5x. O ponto de atenção é conhecido: o teto de uso do 5x costuma ser atingido em sessões longas de refatoração de backend, normalmente nas semanas 3 e 7, quando o schema muda. Se isso acontecer, subir UMA das contas para 20x custa R$ 560 a mais por mês e resolve, sem mexer no cronograma.</w:t>
+      </w:r>
+    </w:p>
+    <w:p>
+      <w:pPr>
+        <w:spacing w:after="100"/>
+      </w:pPr>
+    </w:p>
+    <w:p>
+      <w:pPr>
+        <w:spacing w:after="140" w:line="290"/>
+      </w:pPr>
+      <w:r>
+        <w:rPr>
+          <w:rFonts w:ascii="Inter" w:cs="Inter" w:eastAsia="Inter" w:hAnsi="Inter"/>
+          <w:b w:val="false"/>
+          <w:bCs w:val="false"/>
+          <w:i/>
+          <w:iCs/>
+          <w:color w:val="4A4A46"/>
+          <w:sz w:val="19"/>
+          <w:szCs w:val="19"/>
+        </w:rPr>
+        <w:t xml:space="preserve">Regra prática: se qualquer um dos dois perder mais de meio dia de trabalho por limite de uso, sobe a conta no mês seguinte. Meio dia parado custa mais que os R$ 560.</w:t>
       </w:r>
     </w:p>
     <w:p>
@@ -11372,7 +11395,7 @@
                 <w:sz w:val="17"/>
                 <w:szCs w:val="17"/>
               </w:rPr>
-              <w:t xml:space="preserve">Claude Max (1 × 20x + 1 × 5x)</w:t>
+              <w:t xml:space="preserve">Claude Max (2 × 5x)</w:t>
             </w:r>
           </w:p>
         </w:tc>
@@ -11401,7 +11424,7 @@
                 <w:sz w:val="17"/>
                 <w:szCs w:val="17"/>
               </w:rPr>
-              <w:t xml:space="preserve">R$ 1.680</w:t>
+              <w:t xml:space="preserve">R$ 1.120</w:t>
             </w:r>
           </w:p>
         </w:tc>
@@ -11430,7 +11453,7 @@
                 <w:sz w:val="17"/>
                 <w:szCs w:val="17"/>
               </w:rPr>
-              <w:t xml:space="preserve">R$ 1.680</w:t>
+              <w:t xml:space="preserve">R$ 1.120</w:t>
             </w:r>
           </w:p>
         </w:tc>
@@ -11459,7 +11482,7 @@
                 <w:sz w:val="17"/>
                 <w:szCs w:val="17"/>
               </w:rPr>
-              <w:t xml:space="preserve">R$ 1.680</w:t>
+              <w:t xml:space="preserve">R$ 1.120</w:t>
             </w:r>
           </w:p>
         </w:tc>
@@ -11488,7 +11511,7 @@
                 <w:sz w:val="17"/>
                 <w:szCs w:val="17"/>
               </w:rPr>
-              <w:t xml:space="preserve">R$ 5.040</w:t>
+              <w:t xml:space="preserve">R$ 3.360</w:t>
             </w:r>
           </w:p>
         </w:tc>
@@ -12136,7 +12159,7 @@
                 <w:sz w:val="17"/>
                 <w:szCs w:val="17"/>
               </w:rPr>
-              <w:t xml:space="preserve">R$ 1.680</w:t>
+              <w:t xml:space="preserve">R$ 1.120</w:t>
             </w:r>
           </w:p>
         </w:tc>
@@ -12165,7 +12188,7 @@
                 <w:sz w:val="17"/>
                 <w:szCs w:val="17"/>
               </w:rPr>
-              <w:t xml:space="preserve">R$ 2.934</w:t>
+              <w:t xml:space="preserve">R$ 2.374</w:t>
             </w:r>
           </w:p>
         </w:tc>
@@ -12194,7 +12217,7 @@
                 <w:sz w:val="17"/>
                 <w:szCs w:val="17"/>
               </w:rPr>
-              <w:t xml:space="preserve">R$ 2.934</w:t>
+              <w:t xml:space="preserve">R$ 2.374</w:t>
             </w:r>
           </w:p>
         </w:tc>
@@ -12223,7 +12246,7 @@
                 <w:sz w:val="17"/>
                 <w:szCs w:val="17"/>
               </w:rPr>
-              <w:t xml:space="preserve">R$ 7.548</w:t>
+              <w:t xml:space="preserve">R$ 5.868</w:t>
             </w:r>
           </w:p>
         </w:tc>
@@ -13356,7 +13379,7 @@
                 <w:sz w:val="17"/>
                 <w:szCs w:val="17"/>
               </w:rPr>
-              <w:t xml:space="preserve">R$ 7.548</w:t>
+              <w:t xml:space="preserve">R$ 5.868</w:t>
             </w:r>
           </w:p>
         </w:tc>
@@ -13476,7 +13499,7 @@
                 <w:sz w:val="17"/>
                 <w:szCs w:val="17"/>
               </w:rPr>
-              <w:t xml:space="preserve">R$ 13.915</w:t>
+              <w:t xml:space="preserve">R$ 12.235</w:t>
             </w:r>
           </w:p>
         </w:tc>
@@ -15083,7 +15106,7 @@
                 <w:sz w:val="17"/>
                 <w:szCs w:val="17"/>
               </w:rPr>
-              <w:t xml:space="preserve">R$ 7.548</w:t>
+              <w:t xml:space="preserve">R$ 5.868</w:t>
             </w:r>
           </w:p>
         </w:tc>
@@ -15854,7 +15877,7 @@
                 <w:sz w:val="17"/>
                 <w:szCs w:val="17"/>
               </w:rPr>
-              <w:t xml:space="preserve">R$ 7.548</w:t>
+              <w:t xml:space="preserve">R$ 5.868</w:t>
             </w:r>
           </w:p>
         </w:tc>
@@ -15914,7 +15937,7 @@
                 <w:sz w:val="17"/>
                 <w:szCs w:val="17"/>
               </w:rPr>
-              <w:t xml:space="preserve">R$ 81.452</w:t>
+              <w:t xml:space="preserve">R$ 83.132</w:t>
             </w:r>
           </w:p>
         </w:tc>
@@ -15974,7 +15997,7 @@
                 <w:sz w:val="17"/>
                 <w:szCs w:val="17"/>
               </w:rPr>
-              <w:t xml:space="preserve">R$ 40.726</w:t>
+              <w:t xml:space="preserve">R$ 41.566</w:t>
             </w:r>
           </w:p>
         </w:tc>
@@ -16034,7 +16057,7 @@
                 <w:sz w:val="17"/>
                 <w:szCs w:val="17"/>
               </w:rPr>
-              <w:t xml:space="preserve">R$ 13.575</w:t>
+              <w:t xml:space="preserve">R$ 13.855</w:t>
             </w:r>
           </w:p>
         </w:tc>
@@ -16060,7 +16083,7 @@
           <w:sz w:val="19"/>
           <w:szCs w:val="19"/>
         </w:rPr>
-        <w:t xml:space="preserve">Considerando Simples Nacional na faixa inicial, o líquido por pessoa fica na casa de R$ 12.000 a R$ 12.700 por mês para 25 horas semanais. É um patamar justo para o perfil de trabalho, sem ser agressivo.</w:t>
+        <w:t xml:space="preserve">Considerando Simples Nacional na faixa inicial, o líquido por pessoa fica na casa de R$ 12.300 a R$ 13.000 por mês para 25 horas semanais. É um patamar justo para o perfil de trabalho, sem ser agressivo.</w:t>
       </w:r>
     </w:p>
     <w:p>
@@ -16539,7 +16562,7 @@
           <w:sz w:val="19"/>
           <w:szCs w:val="19"/>
         </w:rPr>
-        <w:t xml:space="preserve">R$ 694 uma vez para ela, R$ 7.548 que a Bytech gasta nos três meses de construção e R$ 703 por mês depois que o app entra no ar. Isso estabelece que somos transparentes e faz o honorário parecer o que de fato é: trabalho, não intermediação.</w:t>
+        <w:t xml:space="preserve">R$ 694 uma vez para ela, R$ 5.868 que a Bytech gasta nos três meses de construção e R$ 703 por mês depois que o app entra no ar. Isso estabelece que somos transparentes e faz o honorário parecer o que de fato é: trabalho, não intermediação.</w:t>
       </w:r>
     </w:p>
     <w:p>

</xml_diff>